<commit_message>
All changes commit on this day, don't even know what half of them are, I'm just a tired individual who has been working since the morning
</commit_message>
<xml_diff>
--- a/docs/Rules To Follow/App Config.docx
+++ b/docs/Rules To Follow/App Config.docx
@@ -27,7 +27,6 @@
         </w:rPr>
         <w:t xml:space="preserve">The standard WinForms fix: </w:t>
       </w:r>
-      <w:proofErr w:type="spellStart"/>
       <w:r>
         <w:rPr>
           <w:rFonts w:ascii="Courier New" w:eastAsia="Times New Roman" w:hAnsi="Courier New" w:cs="Courier New"/>
@@ -41,7 +40,6 @@
         </w:rPr>
         <w:t>App.config</w:t>
       </w:r>
-      <w:proofErr w:type="spellEnd"/>
     </w:p>
     <w:p>
       <w:pPr>
@@ -70,7 +68,6 @@
         </w:rPr>
         <w:t xml:space="preserve">In Solution Explorer, right-click your project → Add → New Item → search "Application Configuration File" → name it </w:t>
       </w:r>
-      <w:proofErr w:type="spellStart"/>
       <w:r>
         <w:rPr>
           <w:rFonts w:ascii="Courier New" w:eastAsia="Times New Roman" w:hAnsi="Courier New" w:cs="Courier New"/>
@@ -82,7 +79,6 @@
         </w:rPr>
         <w:t>App.config</w:t>
       </w:r>
-      <w:proofErr w:type="spellEnd"/>
       <w:r>
         <w:rPr>
           <w:rFonts w:ascii="Times New Roman" w:eastAsia="Times New Roman" w:hAnsi="Times New Roman" w:cs="Times New Roman"/>
@@ -141,28 +137,12 @@
     </w:p>
     <w:p>
       <w:r>
-        <w:t xml:space="preserve">  &lt;</w:t>
-      </w:r>
-      <w:proofErr w:type="spellStart"/>
-      <w:r>
-        <w:t>connectionStrings</w:t>
-      </w:r>
-      <w:proofErr w:type="spellEnd"/>
-      <w:r>
-        <w:t>&gt;</w:t>
+        <w:t xml:space="preserve">  &lt;connectionStrings&gt;</w:t>
       </w:r>
     </w:p>
     <w:p>
       <w:r>
-        <w:t xml:space="preserve">    &lt;add name="</w:t>
-      </w:r>
-      <w:proofErr w:type="spellStart"/>
-      <w:r>
-        <w:t>ApexConnection</w:t>
-      </w:r>
-      <w:proofErr w:type="spellEnd"/>
-      <w:r>
-        <w:t>"</w:t>
+        <w:t xml:space="preserve">    &lt;add name="ApexConnection"</w:t>
       </w:r>
     </w:p>
     <w:p>
@@ -172,15 +152,7 @@
     </w:p>
     <w:p>
       <w:r>
-        <w:t xml:space="preserve">  &lt;/</w:t>
-      </w:r>
-      <w:proofErr w:type="spellStart"/>
-      <w:r>
-        <w:t>connectionStrings</w:t>
-      </w:r>
-      <w:proofErr w:type="spellEnd"/>
-      <w:r>
-        <w:t>&gt;</w:t>
+        <w:t xml:space="preserve">  &lt;/connectionStrings&gt;</w:t>
       </w:r>
     </w:p>
     <w:p>
@@ -204,21 +176,13 @@
     </w:p>
     <w:p>
       <w:r>
-        <w:t>In this part “</w:t>
-      </w:r>
-      <w:r>
-        <w:t>Password=</w:t>
-      </w:r>
-      <w:proofErr w:type="spellStart"/>
-      <w:r>
-        <w:t>yourpassword</w:t>
-      </w:r>
-      <w:proofErr w:type="spellEnd"/>
-      <w:r>
-        <w:t>;"</w:t>
-      </w:r>
-      <w:r>
-        <w:t xml:space="preserve"> add your MySQL password </w:t>
+        <w:t xml:space="preserve">In this part “Password=yourpassword;" add your MySQL password </w:t>
+      </w:r>
+    </w:p>
+    <w:p/>
+    <w:p>
+      <w:r>
+        <w:t>** DON’T FORGET TO RUN “MYSQL” SERVER IN TASK MANAGER **</w:t>
       </w:r>
     </w:p>
     <w:p/>

</xml_diff>